<commit_message>
Feature: Unterschriftszeilen und Genehmiger im Lehrerplan-Export
Template lehrerstundenplan_template.docx: unter der Plantabelle eine
rahmenlose 3-Spalten-Tabelle mit Oberlinie und den Beschriftungen
"Unterschrift Mitarbeiter" und "Unterschrift Schulleitung". Die leere
Zelle hinter "Genehmigt am ... durch" traegt jetzt ${genehmiger}.

Der Fuss zieht seine Namen aus den Einstellungen im Burgermenue:
Ersteller ist "Nachname, Titel" des Schuljahres (Rueckfall auf den
globalen Anzeigenamen, solange beide Felder leer sind), Genehmiger
kommt aus dem gleichnamigen Feld.

Co-Authored-By: Claude Opus 5 <noreply@anthropic.com>
</commit_message>
<xml_diff>
--- a/src/assets/lehrerstundenplan_template.docx
+++ b/src/assets/lehrerstundenplan_template.docx
@@ -7851,6 +7851,14 @@
                 <w:szCs w:val="20"/>
               </w:rPr>
             </w:pPr>
+            <w:r>
+              <w:rPr>
+                <w:rFonts w:ascii="Cambria" w:hAnsi="Cambria"/>
+                <w:sz w:val="20"/>
+                <w:szCs w:val="20"/>
+              </w:rPr>
+              <w:t xml:space="preserve">${genehmiger}</w:t>
+            </w:r>
           </w:p>
         </w:tc>
       </w:tr>
@@ -7860,6 +7868,137 @@
         <w:rPr>
           <w:sz w:val="20"/>
           <w:szCs w:val="20"/>
+        </w:rPr>
+      </w:pPr>
+    </w:p>
+    <w:tbl>
+      <w:tblPr>
+        <w:tblW w:w="0" w:type="auto"/>
+        <w:tblLayout w:type="fixed"/>
+        <w:tblBorders>
+          <w:top w:val="nil"/>
+          <w:left w:val="nil"/>
+          <w:bottom w:val="nil"/>
+          <w:right w:val="nil"/>
+          <w:insideH w:val="nil"/>
+          <w:insideV w:val="nil"/>
+        </w:tblBorders>
+        <w:tblLook w:val="04A0" w:firstRow="1" w:lastRow="0" w:firstColumn="1" w:lastColumn="0" w:noHBand="0" w:noVBand="1"/>
+      </w:tblPr>
+      <w:tblGrid>
+        <w:gridCol w:w="6402"/>
+        <w:gridCol w:w="718"/>
+        <w:gridCol w:w="7156"/>
+      </w:tblGrid>
+      <w:tr>
+        <w:trPr>
+          <w:trHeight w:val="300"/>
+        </w:trPr>
+        <w:tc>
+          <w:tcPr>
+            <w:tcW w:w="6402" w:type="dxa"/>
+            <w:tcBorders>
+              <w:top w:val="single" w:sz="6" w:space="0" w:color="auto"/>
+              <w:left w:val="nil"/>
+              <w:bottom w:val="nil"/>
+              <w:right w:val="nil"/>
+            </w:tcBorders>
+            <w:tcMar>
+              <w:top w:w="0" w:type="dxa"/>
+              <w:left w:w="0" w:type="dxa"/>
+              <w:bottom w:w="0" w:type="dxa"/>
+              <w:right w:w="0" w:type="dxa"/>
+            </w:tcMar>
+          </w:tcPr>
+          <w:p>
+            <w:pPr>
+              <w:spacing w:before="20" w:after="0"/>
+              <w:rPr>
+                <w:rFonts w:ascii="Cambria" w:hAnsi="Cambria"/>
+                <w:sz w:val="20"/>
+                <w:szCs w:val="20"/>
+              </w:rPr>
+            </w:pPr>
+            <w:r>
+              <w:rPr>
+                <w:rFonts w:ascii="Cambria" w:hAnsi="Cambria"/>
+                <w:sz w:val="20"/>
+                <w:szCs w:val="20"/>
+              </w:rPr>
+              <w:t xml:space="preserve">Unterschrift Mitarbeiter</w:t>
+            </w:r>
+          </w:p>
+        </w:tc>
+        <w:tc>
+          <w:tcPr>
+            <w:tcW w:w="718" w:type="dxa"/>
+            <w:tcBorders>
+              <w:top w:val="nil"/>
+              <w:left w:val="nil"/>
+              <w:bottom w:val="nil"/>
+              <w:right w:val="nil"/>
+            </w:tcBorders>
+            <w:tcMar>
+              <w:top w:w="0" w:type="dxa"/>
+              <w:left w:w="0" w:type="dxa"/>
+              <w:bottom w:w="0" w:type="dxa"/>
+              <w:right w:w="0" w:type="dxa"/>
+            </w:tcMar>
+          </w:tcPr>
+          <w:p>
+            <w:pPr>
+              <w:spacing w:before="20" w:after="0"/>
+              <w:rPr>
+                <w:rFonts w:ascii="Cambria" w:hAnsi="Cambria"/>
+                <w:sz w:val="20"/>
+                <w:szCs w:val="20"/>
+              </w:rPr>
+            </w:pPr>
+          </w:p>
+        </w:tc>
+        <w:tc>
+          <w:tcPr>
+            <w:tcW w:w="7156" w:type="dxa"/>
+            <w:tcBorders>
+              <w:top w:val="single" w:sz="6" w:space="0" w:color="auto"/>
+              <w:left w:val="nil"/>
+              <w:bottom w:val="nil"/>
+              <w:right w:val="nil"/>
+            </w:tcBorders>
+            <w:tcMar>
+              <w:top w:w="0" w:type="dxa"/>
+              <w:left w:w="0" w:type="dxa"/>
+              <w:bottom w:w="0" w:type="dxa"/>
+              <w:right w:w="0" w:type="dxa"/>
+            </w:tcMar>
+          </w:tcPr>
+          <w:p>
+            <w:pPr>
+              <w:spacing w:before="20" w:after="0"/>
+              <w:rPr>
+                <w:rFonts w:ascii="Cambria" w:hAnsi="Cambria"/>
+                <w:sz w:val="20"/>
+                <w:szCs w:val="20"/>
+              </w:rPr>
+            </w:pPr>
+            <w:r>
+              <w:rPr>
+                <w:rFonts w:ascii="Cambria" w:hAnsi="Cambria"/>
+                <w:sz w:val="20"/>
+                <w:szCs w:val="20"/>
+              </w:rPr>
+              <w:t xml:space="preserve">Unterschrift Schulleitung</w:t>
+            </w:r>
+          </w:p>
+        </w:tc>
+      </w:tr>
+    </w:tbl>
+    <w:p>
+      <w:pPr>
+        <w:spacing w:before="0" w:after="0" w:line="20" w:lineRule="exact"/>
+        <w:rPr>
+          <w:sz w:val="2"/>
+          <w:szCs w:val="2"/>
         </w:rPr>
       </w:pPr>
     </w:p>

</xml_diff>

<commit_message>
Fix: "durc" im Lehrerstundenplan heisst wieder "durch"
In den Zeilen "Erstellt am ... durch ..." und "Genehmigt am ... durch ..."
fehlte das h. Die Zelle ist 719 Twips breit, Word zieht davon aber
standardmaessig zweimal 108 Twips Innenabstand ab - es blieben 503, und
"durch" braucht bei 10pt knapp mehr. Weil die Zeile eine feste Hoehe hat,
wurde das Wort abgeschnitten statt umgebrochen.

Der Innenabstand dieser beiden Zellen steht jetzt auf 0; das gewinnt 216
Twips. Spaltenbreiten und Tabellenraster bleiben unberuehrt, andere Zeilen
sind also nicht betroffen. Dieselbe Schreibweise nutzt die
Unterschriftstabelle im selben Dokument schon.

Co-Authored-By: Claude Opus 5 <noreply@anthropic.com>
</commit_message>
<xml_diff>
--- a/src/assets/lehrerstundenplan_template.docx
+++ b/src/assets/lehrerstundenplan_template.docx
@@ -7408,6 +7408,10 @@
               <w:bottom w:val="nil"/>
               <w:right w:val="nil"/>
             </w:tcBorders>
+            <w:tcMar>
+              <w:left w:w="0" w:type="dxa"/>
+              <w:right w:w="0" w:type="dxa"/>
+            </w:tcMar>
           </w:tcPr>
           <w:p>
             <w:pPr>
@@ -7815,6 +7819,10 @@
               <w:left w:val="nil"/>
               <w:right w:val="nil"/>
             </w:tcBorders>
+            <w:tcMar>
+              <w:left w:w="0" w:type="dxa"/>
+              <w:right w:w="0" w:type="dxa"/>
+            </w:tcMar>
           </w:tcPr>
           <w:p>
             <w:pPr>

</xml_diff>

<commit_message>
Feature: Lehrerstundenplan zeigt den Mitersteller
Der Wert aus "Mitersteller Lehrerstundenplan" im Burgermenue erscheint
jetzt im Export - nach demselben Muster wie im Diensteinsatzplan.

Er steht mit "und" auf der Zeile UNTER dem Ersteller: die Zeile hat eine
feste Hoehe, ein Umbruch wuerde abgeschnitten. Zwischen "Erstellt am" und
"Genehmigt am" war ohnehin eine leere Zeile frei, die traegt nun den
Platzhalter ${mitersteller}. Ohne Eintrag bleibt sie leer und der
Ersteller steht ohne Komma.

Geprueft in beiden Faellen: mit Eintrag "Mosel, Otto," / "und R. Straub,
SoKrin", ohne Eintrag "Mosel, Otto". Alle sechs Lehrkraefte passen
weiterhin auf eine Seite - der Text belegt eine Zeile, die vorher leer war.

Co-Authored-By: Claude Opus 5 <noreply@anthropic.com>
</commit_message>
<xml_diff>
--- a/src/assets/lehrerstundenplan_template.docx
+++ b/src/assets/lehrerstundenplan_template.docx
@@ -7652,6 +7652,14 @@
                 <w:szCs w:val="20"/>
               </w:rPr>
             </w:pPr>
+            <w:r>
+              <w:rPr>
+                <w:rFonts w:ascii="Cambria" w:hAnsi="Cambria"/>
+                <w:sz w:val="20"/>
+                <w:szCs w:val="20"/>
+              </w:rPr>
+              <w:t xml:space="preserve">${mitersteller}</w:t>
+            </w:r>
           </w:p>
         </w:tc>
       </w:tr>

</xml_diff>